<commit_message>
add phiếu học tập
</commit_message>
<xml_diff>
--- a/PhieuHocTapCSS-BTTH02/Phiếu học tập CSS - BTTH02 - K66.docx
+++ b/PhieuHocTapCSS-BTTH02/Phiếu học tập CSS - BTTH02 - K66.docx
@@ -16,7 +16,7 @@
           <w:noProof/>
         </w:rPr>
         <w:pict w14:anchorId="4E6FB1D0">
-          <v:rect id="_x0000_s1038" alt="" style="width:475.5pt;height:.05pt;mso-width-percent:0;mso-height-percent:0;mso-left-percent:-10001;mso-top-percent:-10001;mso-position-horizontal:absolute;mso-position-horizontal-relative:char;mso-position-vertical:absolute;mso-position-vertical-relative:line;mso-width-percent:0;mso-height-percent:0;mso-left-percent:-10001;mso-top-percent:-10001" o:hralign="center" o:hrstd="t" strokeweight="1pt">
+          <v:rect id="_x0000_s1037" alt="" style="width:475.5pt;height:.05pt;mso-width-percent:0;mso-height-percent:0;mso-left-percent:-10001;mso-top-percent:-10001;mso-position-horizontal:absolute;mso-position-horizontal-relative:char;mso-position-vertical:absolute;mso-position-vertical-relative:line;mso-width-percent:0;mso-height-percent:0;mso-left-percent:-10001;mso-top-percent:-10001" o:hralign="center" o:hrstd="t" strokeweight="1pt">
             <v:stroke opacity="0"/>
           </v:rect>
         </w:pict>
@@ -129,59 +129,14 @@
           <w:lang w:val="vi-VN"/>
         </w:rPr>
       </w:pPr>
-      <w:proofErr w:type="spellStart"/>
-      <w:r>
-        <w:rPr>
-          <w:rFonts w:ascii="inter" w:eastAsia="inter" w:hAnsi="inter" w:cs="inter"/>
-          <w:b/>
-          <w:color w:val="000000"/>
-        </w:rPr>
-        <w:t>Mã</w:t>
-      </w:r>
-      <w:proofErr w:type="spellEnd"/>
-      <w:r>
-        <w:rPr>
-          <w:rFonts w:ascii="inter" w:eastAsia="inter" w:hAnsi="inter" w:cs="inter"/>
-          <w:b/>
-          <w:color w:val="000000"/>
-        </w:rPr>
-        <w:t xml:space="preserve"> </w:t>
-      </w:r>
-      <w:proofErr w:type="spellStart"/>
-      <w:r>
-        <w:rPr>
-          <w:rFonts w:ascii="inter" w:eastAsia="inter" w:hAnsi="inter" w:cs="inter"/>
-          <w:b/>
-          <w:color w:val="000000"/>
-        </w:rPr>
-        <w:t>sinh</w:t>
-      </w:r>
-      <w:proofErr w:type="spellEnd"/>
-      <w:r>
-        <w:rPr>
-          <w:rFonts w:ascii="inter" w:eastAsia="inter" w:hAnsi="inter" w:cs="inter"/>
-          <w:b/>
-          <w:color w:val="000000"/>
-        </w:rPr>
-        <w:t xml:space="preserve"> </w:t>
-      </w:r>
-      <w:proofErr w:type="spellStart"/>
-      <w:r>
-        <w:rPr>
-          <w:rFonts w:ascii="inter" w:eastAsia="inter" w:hAnsi="inter" w:cs="inter"/>
-          <w:b/>
-          <w:color w:val="000000"/>
-        </w:rPr>
-        <w:t>viên</w:t>
-      </w:r>
-      <w:proofErr w:type="spellEnd"/>
-      <w:r>
-        <w:rPr>
-          <w:rFonts w:ascii="inter" w:eastAsia="inter" w:hAnsi="inter" w:cs="inter"/>
-          <w:b/>
-          <w:color w:val="000000"/>
-        </w:rPr>
-        <w:t>:</w:t>
+      <w:r>
+        <w:rPr>
+          <w:rFonts w:ascii="inter" w:eastAsia="inter" w:hAnsi="inter" w:cs="inter"/>
+          <w:b/>
+          <w:color w:val="000000"/>
+          <w:lang w:val="vi-VN"/>
+        </w:rPr>
+        <w:t>Mã sinh viên:</w:t>
       </w:r>
       <w:r>
         <w:rPr>
@@ -228,21 +183,23 @@
         <w:rPr>
           <w:rFonts w:ascii="inter" w:eastAsia="inter" w:hAnsi="inter" w:cs="inter"/>
           <w:color w:val="000000"/>
-        </w:rPr>
-        <w:t xml:space="preserve"> </w:t>
-      </w:r>
-      <w:r>
-        <w:rPr>
-          <w:rFonts w:ascii="inter" w:eastAsia="inter" w:hAnsi="inter" w:cs="inter"/>
-          <w:color w:val="000000"/>
           <w:lang w:val="vi-VN"/>
         </w:rPr>
+        <w:t xml:space="preserve"> </w:t>
+      </w:r>
+      <w:r>
+        <w:rPr>
+          <w:rFonts w:ascii="inter" w:eastAsia="inter" w:hAnsi="inter" w:cs="inter"/>
+          <w:color w:val="000000"/>
+          <w:lang w:val="vi-VN"/>
+        </w:rPr>
         <w:t>+</w:t>
       </w:r>
       <w:r>
         <w:rPr>
           <w:rFonts w:ascii="inter" w:eastAsia="inter" w:hAnsi="inter" w:cs="inter"/>
           <w:color w:val="000000"/>
+          <w:lang w:val="vi-VN"/>
         </w:rPr>
         <w:t xml:space="preserve"> </w:t>
       </w:r>
@@ -277,7 +234,39 @@
           <w:color w:val="000000"/>
           <w:lang w:val="vi-VN"/>
         </w:rPr>
-        <w:t xml:space="preserve"> 04/03/2026</w:t>
+        <w:t xml:space="preserve"> </w:t>
+      </w:r>
+      <w:r>
+        <w:rPr>
+          <w:rFonts w:ascii="inter" w:eastAsia="inter" w:hAnsi="inter" w:cs="inter"/>
+          <w:color w:val="000000"/>
+          <w:lang w:val="vi-VN"/>
+        </w:rPr>
+        <w:t>25</w:t>
+      </w:r>
+      <w:r>
+        <w:rPr>
+          <w:rFonts w:ascii="inter" w:eastAsia="inter" w:hAnsi="inter" w:cs="inter"/>
+          <w:color w:val="000000"/>
+          <w:lang w:val="vi-VN"/>
+        </w:rPr>
+        <w:t>/</w:t>
+      </w:r>
+      <w:r>
+        <w:rPr>
+          <w:rFonts w:ascii="inter" w:eastAsia="inter" w:hAnsi="inter" w:cs="inter"/>
+          <w:color w:val="000000"/>
+          <w:lang w:val="vi-VN"/>
+        </w:rPr>
+        <w:t>02</w:t>
+      </w:r>
+      <w:r>
+        <w:rPr>
+          <w:rFonts w:ascii="inter" w:eastAsia="inter" w:hAnsi="inter" w:cs="inter"/>
+          <w:color w:val="000000"/>
+          <w:lang w:val="vi-VN"/>
+        </w:rPr>
+        <w:t>/2026</w:t>
       </w:r>
     </w:p>
     <w:p>
@@ -294,7 +283,7 @@
           <w:noProof/>
         </w:rPr>
         <w:pict w14:anchorId="1FFA2B47">
-          <v:rect id="_x0000_s1037" alt="" style="width:475.5pt;height:.05pt;mso-width-percent:0;mso-height-percent:0;mso-left-percent:-10001;mso-top-percent:-10001;mso-position-horizontal:absolute;mso-position-horizontal-relative:char;mso-position-vertical:absolute;mso-position-vertical-relative:line;mso-width-percent:0;mso-height-percent:0;mso-left-percent:-10001;mso-top-percent:-10001" o:hralign="center" o:hrstd="t" strokeweight="1pt">
+          <v:rect id="_x0000_s1036" alt="" style="width:475.5pt;height:.05pt;mso-width-percent:0;mso-height-percent:0;mso-left-percent:-10001;mso-top-percent:-10001;mso-position-horizontal:absolute;mso-position-horizontal-relative:char;mso-position-vertical:absolute;mso-position-vertical-relative:line;mso-width-percent:0;mso-height-percent:0;mso-left-percent:-10001;mso-top-percent:-10001" o:hralign="center" o:hrstd="t" strokeweight="1pt">
             <v:stroke opacity="0"/>
           </v:rect>
         </w:pict>
@@ -2905,13 +2894,22 @@
                 <w:iCs/>
                 <w:sz w:val="22"/>
               </w:rPr>
-              <w:t>style = “</w:t>
-            </w:r>
+              <w:t xml:space="preserve">style = </w:t>
+            </w:r>
+            <w:proofErr w:type="gramStart"/>
             <w:r>
               <w:rPr>
                 <w:rFonts w:asciiTheme="majorHAnsi" w:hAnsiTheme="majorHAnsi"/>
                 <w:iCs/>
                 <w:sz w:val="22"/>
+              </w:rPr>
+              <w:t>“</w:t>
+            </w:r>
+            <w:r>
+              <w:rPr>
+                <w:rFonts w:asciiTheme="majorHAnsi" w:hAnsiTheme="majorHAnsi"/>
+                <w:iCs/>
+                <w:sz w:val="22"/>
                 <w:lang w:val="vi-VN"/>
               </w:rPr>
               <w:t xml:space="preserve"> </w:t>
@@ -2924,6 +2922,7 @@
               </w:rPr>
               <w:t>”</w:t>
             </w:r>
+            <w:proofErr w:type="gramEnd"/>
           </w:p>
         </w:tc>
         <w:tc>
@@ -4989,8 +4988,45 @@
                 <w:szCs w:val="20"/>
                 <w:shd w:val="clear" w:color="auto" w:fill="F8F8FA"/>
               </w:rPr>
-              <w:t>* { margin: 0; }</w:t>
-            </w:r>
+              <w:t xml:space="preserve">* </w:t>
+            </w:r>
+            <w:proofErr w:type="gramStart"/>
+            <w:r>
+              <w:rPr>
+                <w:rStyle w:val="VerbatimChar"/>
+                <w:rFonts w:ascii="IBM Plex Mono" w:eastAsia="IBM Plex Mono" w:hAnsi="IBM Plex Mono" w:cs="IBM Plex Mono"/>
+                <w:color w:val="000000"/>
+                <w:sz w:val="20"/>
+                <w:szCs w:val="20"/>
+                <w:shd w:val="clear" w:color="auto" w:fill="F8F8FA"/>
+              </w:rPr>
+              <w:t>{ margin</w:t>
+            </w:r>
+            <w:proofErr w:type="gramEnd"/>
+            <w:r>
+              <w:rPr>
+                <w:rStyle w:val="VerbatimChar"/>
+                <w:rFonts w:ascii="IBM Plex Mono" w:eastAsia="IBM Plex Mono" w:hAnsi="IBM Plex Mono" w:cs="IBM Plex Mono"/>
+                <w:color w:val="000000"/>
+                <w:sz w:val="20"/>
+                <w:szCs w:val="20"/>
+                <w:shd w:val="clear" w:color="auto" w:fill="F8F8FA"/>
+              </w:rPr>
+              <w:t>: 0</w:t>
+            </w:r>
+            <w:proofErr w:type="gramStart"/>
+            <w:r>
+              <w:rPr>
+                <w:rStyle w:val="VerbatimChar"/>
+                <w:rFonts w:ascii="IBM Plex Mono" w:eastAsia="IBM Plex Mono" w:hAnsi="IBM Plex Mono" w:cs="IBM Plex Mono"/>
+                <w:color w:val="000000"/>
+                <w:sz w:val="20"/>
+                <w:szCs w:val="20"/>
+                <w:shd w:val="clear" w:color="auto" w:fill="F8F8FA"/>
+              </w:rPr>
+              <w:t>; }</w:t>
+            </w:r>
+            <w:proofErr w:type="gramEnd"/>
           </w:p>
         </w:tc>
         <w:tc>
@@ -5280,8 +5316,45 @@
                 <w:szCs w:val="20"/>
                 <w:shd w:val="clear" w:color="auto" w:fill="F8F8FA"/>
               </w:rPr>
-              <w:t>p { color: blue; }</w:t>
-            </w:r>
+              <w:t xml:space="preserve">p </w:t>
+            </w:r>
+            <w:proofErr w:type="gramStart"/>
+            <w:r>
+              <w:rPr>
+                <w:rStyle w:val="VerbatimChar"/>
+                <w:rFonts w:ascii="IBM Plex Mono" w:eastAsia="IBM Plex Mono" w:hAnsi="IBM Plex Mono" w:cs="IBM Plex Mono"/>
+                <w:color w:val="000000"/>
+                <w:sz w:val="20"/>
+                <w:szCs w:val="20"/>
+                <w:shd w:val="clear" w:color="auto" w:fill="F8F8FA"/>
+              </w:rPr>
+              <w:t>{ color</w:t>
+            </w:r>
+            <w:proofErr w:type="gramEnd"/>
+            <w:r>
+              <w:rPr>
+                <w:rStyle w:val="VerbatimChar"/>
+                <w:rFonts w:ascii="IBM Plex Mono" w:eastAsia="IBM Plex Mono" w:hAnsi="IBM Plex Mono" w:cs="IBM Plex Mono"/>
+                <w:color w:val="000000"/>
+                <w:sz w:val="20"/>
+                <w:szCs w:val="20"/>
+                <w:shd w:val="clear" w:color="auto" w:fill="F8F8FA"/>
+              </w:rPr>
+              <w:t>: blue</w:t>
+            </w:r>
+            <w:proofErr w:type="gramStart"/>
+            <w:r>
+              <w:rPr>
+                <w:rStyle w:val="VerbatimChar"/>
+                <w:rFonts w:ascii="IBM Plex Mono" w:eastAsia="IBM Plex Mono" w:hAnsi="IBM Plex Mono" w:cs="IBM Plex Mono"/>
+                <w:color w:val="000000"/>
+                <w:sz w:val="20"/>
+                <w:szCs w:val="20"/>
+                <w:shd w:val="clear" w:color="auto" w:fill="F8F8FA"/>
+              </w:rPr>
+              <w:t>; }</w:t>
+            </w:r>
+            <w:proofErr w:type="gramEnd"/>
           </w:p>
         </w:tc>
         <w:tc>
@@ -5554,6 +5627,7 @@
                 <w:szCs w:val="20"/>
               </w:rPr>
             </w:pPr>
+            <w:proofErr w:type="gramStart"/>
             <w:r>
               <w:rPr>
                 <w:rStyle w:val="VerbatimChar"/>
@@ -5578,6 +5652,7 @@
               <w:t>className</w:t>
             </w:r>
             <w:proofErr w:type="spellEnd"/>
+            <w:proofErr w:type="gramEnd"/>
           </w:p>
         </w:tc>
         <w:tc>
@@ -5597,6 +5672,7 @@
                 <w:szCs w:val="20"/>
               </w:rPr>
             </w:pPr>
+            <w:proofErr w:type="gramStart"/>
             <w:r>
               <w:rPr>
                 <w:rStyle w:val="VerbatimChar"/>
@@ -5621,6 +5697,7 @@
               <w:t>btn</w:t>
             </w:r>
             <w:proofErr w:type="spellEnd"/>
+            <w:proofErr w:type="gramEnd"/>
             <w:r>
               <w:rPr>
                 <w:rStyle w:val="VerbatimChar"/>
@@ -5630,8 +5707,45 @@
                 <w:szCs w:val="20"/>
                 <w:shd w:val="clear" w:color="auto" w:fill="F8F8FA"/>
               </w:rPr>
-              <w:t xml:space="preserve"> { padding: 10px; }</w:t>
-            </w:r>
+              <w:t xml:space="preserve"> </w:t>
+            </w:r>
+            <w:proofErr w:type="gramStart"/>
+            <w:r>
+              <w:rPr>
+                <w:rStyle w:val="VerbatimChar"/>
+                <w:rFonts w:ascii="IBM Plex Mono" w:eastAsia="IBM Plex Mono" w:hAnsi="IBM Plex Mono" w:cs="IBM Plex Mono"/>
+                <w:color w:val="000000"/>
+                <w:sz w:val="20"/>
+                <w:szCs w:val="20"/>
+                <w:shd w:val="clear" w:color="auto" w:fill="F8F8FA"/>
+              </w:rPr>
+              <w:t>{ padding</w:t>
+            </w:r>
+            <w:proofErr w:type="gramEnd"/>
+            <w:r>
+              <w:rPr>
+                <w:rStyle w:val="VerbatimChar"/>
+                <w:rFonts w:ascii="IBM Plex Mono" w:eastAsia="IBM Plex Mono" w:hAnsi="IBM Plex Mono" w:cs="IBM Plex Mono"/>
+                <w:color w:val="000000"/>
+                <w:sz w:val="20"/>
+                <w:szCs w:val="20"/>
+                <w:shd w:val="clear" w:color="auto" w:fill="F8F8FA"/>
+              </w:rPr>
+              <w:t>: 10px</w:t>
+            </w:r>
+            <w:proofErr w:type="gramStart"/>
+            <w:r>
+              <w:rPr>
+                <w:rStyle w:val="VerbatimChar"/>
+                <w:rFonts w:ascii="IBM Plex Mono" w:eastAsia="IBM Plex Mono" w:hAnsi="IBM Plex Mono" w:cs="IBM Plex Mono"/>
+                <w:color w:val="000000"/>
+                <w:sz w:val="20"/>
+                <w:szCs w:val="20"/>
+                <w:shd w:val="clear" w:color="auto" w:fill="F8F8FA"/>
+              </w:rPr>
+              <w:t>; }</w:t>
+            </w:r>
+            <w:proofErr w:type="gramEnd"/>
           </w:p>
         </w:tc>
         <w:tc>
@@ -5899,8 +6013,45 @@
                 <w:szCs w:val="20"/>
                 <w:shd w:val="clear" w:color="auto" w:fill="F8F8FA"/>
               </w:rPr>
-              <w:t>#header { background: gray; }</w:t>
-            </w:r>
+              <w:t xml:space="preserve">#header </w:t>
+            </w:r>
+            <w:proofErr w:type="gramStart"/>
+            <w:r>
+              <w:rPr>
+                <w:rStyle w:val="VerbatimChar"/>
+                <w:rFonts w:ascii="IBM Plex Mono" w:eastAsia="IBM Plex Mono" w:hAnsi="IBM Plex Mono" w:cs="IBM Plex Mono"/>
+                <w:color w:val="000000"/>
+                <w:sz w:val="20"/>
+                <w:szCs w:val="20"/>
+                <w:shd w:val="clear" w:color="auto" w:fill="F8F8FA"/>
+              </w:rPr>
+              <w:t>{ background</w:t>
+            </w:r>
+            <w:proofErr w:type="gramEnd"/>
+            <w:r>
+              <w:rPr>
+                <w:rStyle w:val="VerbatimChar"/>
+                <w:rFonts w:ascii="IBM Plex Mono" w:eastAsia="IBM Plex Mono" w:hAnsi="IBM Plex Mono" w:cs="IBM Plex Mono"/>
+                <w:color w:val="000000"/>
+                <w:sz w:val="20"/>
+                <w:szCs w:val="20"/>
+                <w:shd w:val="clear" w:color="auto" w:fill="F8F8FA"/>
+              </w:rPr>
+              <w:t>: gray</w:t>
+            </w:r>
+            <w:proofErr w:type="gramStart"/>
+            <w:r>
+              <w:rPr>
+                <w:rStyle w:val="VerbatimChar"/>
+                <w:rFonts w:ascii="IBM Plex Mono" w:eastAsia="IBM Plex Mono" w:hAnsi="IBM Plex Mono" w:cs="IBM Plex Mono"/>
+                <w:color w:val="000000"/>
+                <w:sz w:val="20"/>
+                <w:szCs w:val="20"/>
+                <w:shd w:val="clear" w:color="auto" w:fill="F8F8FA"/>
+              </w:rPr>
+              <w:t>; }</w:t>
+            </w:r>
+            <w:proofErr w:type="gramEnd"/>
           </w:p>
         </w:tc>
         <w:tc>
@@ -6159,8 +6310,45 @@
                 <w:szCs w:val="20"/>
                 <w:shd w:val="clear" w:color="auto" w:fill="F8F8FA"/>
               </w:rPr>
-              <w:t>nav a { text-decoration: none; }</w:t>
-            </w:r>
+              <w:t xml:space="preserve">nav a </w:t>
+            </w:r>
+            <w:proofErr w:type="gramStart"/>
+            <w:r>
+              <w:rPr>
+                <w:rStyle w:val="VerbatimChar"/>
+                <w:rFonts w:ascii="IBM Plex Mono" w:eastAsia="IBM Plex Mono" w:hAnsi="IBM Plex Mono" w:cs="IBM Plex Mono"/>
+                <w:color w:val="000000"/>
+                <w:sz w:val="20"/>
+                <w:szCs w:val="20"/>
+                <w:shd w:val="clear" w:color="auto" w:fill="F8F8FA"/>
+              </w:rPr>
+              <w:t>{ text</w:t>
+            </w:r>
+            <w:proofErr w:type="gramEnd"/>
+            <w:r>
+              <w:rPr>
+                <w:rStyle w:val="VerbatimChar"/>
+                <w:rFonts w:ascii="IBM Plex Mono" w:eastAsia="IBM Plex Mono" w:hAnsi="IBM Plex Mono" w:cs="IBM Plex Mono"/>
+                <w:color w:val="000000"/>
+                <w:sz w:val="20"/>
+                <w:szCs w:val="20"/>
+                <w:shd w:val="clear" w:color="auto" w:fill="F8F8FA"/>
+              </w:rPr>
+              <w:t>-decoration: none</w:t>
+            </w:r>
+            <w:proofErr w:type="gramStart"/>
+            <w:r>
+              <w:rPr>
+                <w:rStyle w:val="VerbatimChar"/>
+                <w:rFonts w:ascii="IBM Plex Mono" w:eastAsia="IBM Plex Mono" w:hAnsi="IBM Plex Mono" w:cs="IBM Plex Mono"/>
+                <w:color w:val="000000"/>
+                <w:sz w:val="20"/>
+                <w:szCs w:val="20"/>
+                <w:shd w:val="clear" w:color="auto" w:fill="F8F8FA"/>
+              </w:rPr>
+              <w:t>; }</w:t>
+            </w:r>
+            <w:proofErr w:type="gramEnd"/>
           </w:p>
         </w:tc>
         <w:tc>
@@ -6506,8 +6694,45 @@
                 <w:szCs w:val="20"/>
                 <w:shd w:val="clear" w:color="auto" w:fill="F8F8FA"/>
               </w:rPr>
-              <w:t>h1, h2, h3 { font-family: Arial; }</w:t>
-            </w:r>
+              <w:t xml:space="preserve">h1, h2, h3 </w:t>
+            </w:r>
+            <w:proofErr w:type="gramStart"/>
+            <w:r>
+              <w:rPr>
+                <w:rStyle w:val="VerbatimChar"/>
+                <w:rFonts w:ascii="IBM Plex Mono" w:eastAsia="IBM Plex Mono" w:hAnsi="IBM Plex Mono" w:cs="IBM Plex Mono"/>
+                <w:color w:val="000000"/>
+                <w:sz w:val="20"/>
+                <w:szCs w:val="20"/>
+                <w:shd w:val="clear" w:color="auto" w:fill="F8F8FA"/>
+              </w:rPr>
+              <w:t>{ font</w:t>
+            </w:r>
+            <w:proofErr w:type="gramEnd"/>
+            <w:r>
+              <w:rPr>
+                <w:rStyle w:val="VerbatimChar"/>
+                <w:rFonts w:ascii="IBM Plex Mono" w:eastAsia="IBM Plex Mono" w:hAnsi="IBM Plex Mono" w:cs="IBM Plex Mono"/>
+                <w:color w:val="000000"/>
+                <w:sz w:val="20"/>
+                <w:szCs w:val="20"/>
+                <w:shd w:val="clear" w:color="auto" w:fill="F8F8FA"/>
+              </w:rPr>
+              <w:t>-family: Arial</w:t>
+            </w:r>
+            <w:proofErr w:type="gramStart"/>
+            <w:r>
+              <w:rPr>
+                <w:rStyle w:val="VerbatimChar"/>
+                <w:rFonts w:ascii="IBM Plex Mono" w:eastAsia="IBM Plex Mono" w:hAnsi="IBM Plex Mono" w:cs="IBM Plex Mono"/>
+                <w:color w:val="000000"/>
+                <w:sz w:val="20"/>
+                <w:szCs w:val="20"/>
+                <w:shd w:val="clear" w:color="auto" w:fill="F8F8FA"/>
+              </w:rPr>
+              <w:t>; }</w:t>
+            </w:r>
+            <w:proofErr w:type="gramEnd"/>
           </w:p>
         </w:tc>
         <w:tc>
@@ -6749,6 +6974,7 @@
               </w:rPr>
             </w:pPr>
             <w:proofErr w:type="spellStart"/>
+            <w:proofErr w:type="gramStart"/>
             <w:r>
               <w:rPr>
                 <w:rStyle w:val="VerbatimChar"/>
@@ -6761,6 +6987,7 @@
               <w:t>selector:state</w:t>
             </w:r>
             <w:proofErr w:type="spellEnd"/>
+            <w:proofErr w:type="gramEnd"/>
           </w:p>
         </w:tc>
         <w:tc>
@@ -6780,6 +7007,7 @@
                 <w:szCs w:val="20"/>
               </w:rPr>
             </w:pPr>
+            <w:proofErr w:type="gramStart"/>
             <w:r>
               <w:rPr>
                 <w:rStyle w:val="VerbatimChar"/>
@@ -6789,8 +7017,57 @@
                 <w:szCs w:val="20"/>
                 <w:shd w:val="clear" w:color="auto" w:fill="F8F8FA"/>
               </w:rPr>
-              <w:t>a:hover { color: red; }</w:t>
-            </w:r>
+              <w:t>a:hover</w:t>
+            </w:r>
+            <w:proofErr w:type="gramEnd"/>
+            <w:r>
+              <w:rPr>
+                <w:rStyle w:val="VerbatimChar"/>
+                <w:rFonts w:ascii="IBM Plex Mono" w:eastAsia="IBM Plex Mono" w:hAnsi="IBM Plex Mono" w:cs="IBM Plex Mono"/>
+                <w:color w:val="000000"/>
+                <w:sz w:val="20"/>
+                <w:szCs w:val="20"/>
+                <w:shd w:val="clear" w:color="auto" w:fill="F8F8FA"/>
+              </w:rPr>
+              <w:t xml:space="preserve"> </w:t>
+            </w:r>
+            <w:proofErr w:type="gramStart"/>
+            <w:r>
+              <w:rPr>
+                <w:rStyle w:val="VerbatimChar"/>
+                <w:rFonts w:ascii="IBM Plex Mono" w:eastAsia="IBM Plex Mono" w:hAnsi="IBM Plex Mono" w:cs="IBM Plex Mono"/>
+                <w:color w:val="000000"/>
+                <w:sz w:val="20"/>
+                <w:szCs w:val="20"/>
+                <w:shd w:val="clear" w:color="auto" w:fill="F8F8FA"/>
+              </w:rPr>
+              <w:t>{ color</w:t>
+            </w:r>
+            <w:proofErr w:type="gramEnd"/>
+            <w:r>
+              <w:rPr>
+                <w:rStyle w:val="VerbatimChar"/>
+                <w:rFonts w:ascii="IBM Plex Mono" w:eastAsia="IBM Plex Mono" w:hAnsi="IBM Plex Mono" w:cs="IBM Plex Mono"/>
+                <w:color w:val="000000"/>
+                <w:sz w:val="20"/>
+                <w:szCs w:val="20"/>
+                <w:shd w:val="clear" w:color="auto" w:fill="F8F8FA"/>
+              </w:rPr>
+              <w:t>: red</w:t>
+            </w:r>
+            <w:proofErr w:type="gramStart"/>
+            <w:r>
+              <w:rPr>
+                <w:rStyle w:val="VerbatimChar"/>
+                <w:rFonts w:ascii="IBM Plex Mono" w:eastAsia="IBM Plex Mono" w:hAnsi="IBM Plex Mono" w:cs="IBM Plex Mono"/>
+                <w:color w:val="000000"/>
+                <w:sz w:val="20"/>
+                <w:szCs w:val="20"/>
+                <w:shd w:val="clear" w:color="auto" w:fill="F8F8FA"/>
+              </w:rPr>
+              <w:t>; }</w:t>
+            </w:r>
+            <w:proofErr w:type="gramEnd"/>
           </w:p>
         </w:tc>
         <w:tc>
@@ -6995,7 +7272,7 @@
           <w:noProof/>
         </w:rPr>
         <w:pict w14:anchorId="4EE2617E">
-          <v:rect id="_x0000_s1036" alt="" style="width:475.5pt;height:.05pt;mso-width-percent:0;mso-height-percent:0;mso-left-percent:-10001;mso-top-percent:-10001;mso-position-horizontal:absolute;mso-position-horizontal-relative:char;mso-position-vertical:absolute;mso-position-vertical-relative:line;mso-width-percent:0;mso-height-percent:0;mso-left-percent:-10001;mso-top-percent:-10001" o:hralign="center" o:hrstd="t" strokeweight="1pt">
+          <v:rect id="_x0000_s1035" alt="" style="width:475.5pt;height:.05pt;mso-width-percent:0;mso-height-percent:0;mso-left-percent:-10001;mso-top-percent:-10001;mso-position-horizontal:absolute;mso-position-horizontal-relative:char;mso-position-vertical:absolute;mso-position-vertical-relative:line;mso-width-percent:0;mso-height-percent:0;mso-left-percent:-10001;mso-top-percent:-10001" o:hralign="center" o:hrstd="t" strokeweight="1pt">
             <v:stroke opacity="0"/>
           </v:rect>
         </w:pict>
@@ -8242,7 +8519,27 @@
           <w:sz w:val="18"/>
         </w:rPr>
         <w:br/>
-        <w:t xml:space="preserve">        &lt;p&gt;&amp;copy; 2026 My Blog. All rights reserved.&lt;/p&gt;</w:t>
+        <w:t xml:space="preserve">        &lt;p&gt;&amp;copy; 2026 My Blog. All rights </w:t>
+      </w:r>
+      <w:proofErr w:type="gramStart"/>
+      <w:r>
+        <w:rPr>
+          <w:rStyle w:val="VerbatimChar"/>
+          <w:rFonts w:ascii="IBM Plex Mono" w:eastAsia="IBM Plex Mono" w:hAnsi="IBM Plex Mono" w:cs="IBM Plex Mono"/>
+          <w:color w:val="000000"/>
+          <w:sz w:val="18"/>
+        </w:rPr>
+        <w:t>reserved.&lt;</w:t>
+      </w:r>
+      <w:proofErr w:type="gramEnd"/>
+      <w:r>
+        <w:rPr>
+          <w:rStyle w:val="VerbatimChar"/>
+          <w:rFonts w:ascii="IBM Plex Mono" w:eastAsia="IBM Plex Mono" w:hAnsi="IBM Plex Mono" w:cs="IBM Plex Mono"/>
+          <w:color w:val="000000"/>
+          <w:sz w:val="18"/>
+        </w:rPr>
+        <w:t>/p&gt;</w:t>
       </w:r>
       <w:r>
         <w:rPr>
@@ -8521,14 +8818,25 @@
         <w:shd w:val="clear" w:color="auto" w:fill="F8F8FA"/>
         <w:spacing w:line="336" w:lineRule="auto"/>
       </w:pPr>
-      <w:r>
-        <w:rPr>
-          <w:rStyle w:val="VerbatimChar"/>
-          <w:rFonts w:ascii="IBM Plex Mono" w:eastAsia="IBM Plex Mono" w:hAnsi="IBM Plex Mono" w:cs="IBM Plex Mono"/>
-          <w:color w:val="000000"/>
-          <w:sz w:val="18"/>
-        </w:rPr>
-        <w:t xml:space="preserve">&lt;!-- TODO: </w:t>
+      <w:proofErr w:type="gramStart"/>
+      <w:r>
+        <w:rPr>
+          <w:rStyle w:val="VerbatimChar"/>
+          <w:rFonts w:ascii="IBM Plex Mono" w:eastAsia="IBM Plex Mono" w:hAnsi="IBM Plex Mono" w:cs="IBM Plex Mono"/>
+          <w:color w:val="000000"/>
+          <w:sz w:val="18"/>
+        </w:rPr>
+        <w:t>&lt;!--</w:t>
+      </w:r>
+      <w:proofErr w:type="gramEnd"/>
+      <w:r>
+        <w:rPr>
+          <w:rStyle w:val="VerbatimChar"/>
+          <w:rFonts w:ascii="IBM Plex Mono" w:eastAsia="IBM Plex Mono" w:hAnsi="IBM Plex Mono" w:cs="IBM Plex Mono"/>
+          <w:color w:val="000000"/>
+          <w:sz w:val="18"/>
+        </w:rPr>
+        <w:t xml:space="preserve"> TODO: </w:t>
       </w:r>
       <w:proofErr w:type="spellStart"/>
       <w:r>
@@ -10621,7 +10929,7 @@
           <w:noProof/>
         </w:rPr>
         <w:pict w14:anchorId="1C132D59">
-          <v:rect id="_x0000_s1035" alt="" style="width:475.5pt;height:.05pt;mso-width-percent:0;mso-height-percent:0;mso-left-percent:-10001;mso-top-percent:-10001;mso-position-horizontal:absolute;mso-position-horizontal-relative:char;mso-position-vertical:absolute;mso-position-vertical-relative:line;mso-width-percent:0;mso-height-percent:0;mso-left-percent:-10001;mso-top-percent:-10001" o:hralign="center" o:hrstd="t" strokeweight="1pt">
+          <v:rect id="_x0000_s1034" alt="" style="width:475.5pt;height:.05pt;mso-width-percent:0;mso-height-percent:0;mso-left-percent:-10001;mso-top-percent:-10001;mso-position-horizontal:absolute;mso-position-horizontal-relative:char;mso-position-vertical:absolute;mso-position-vertical-relative:line;mso-width-percent:0;mso-height-percent:0;mso-left-percent:-10001;mso-top-percent:-10001" o:hralign="center" o:hrstd="t" strokeweight="1pt">
             <v:stroke opacity="0"/>
           </v:rect>
         </w:pict>
@@ -13672,23 +13980,7 @@
           <w:sz w:val="22"/>
           <w:lang w:val="vi-VN"/>
         </w:rPr>
-        <w:t xml:space="preserve"> không làm phần tử bị </w:t>
-      </w:r>
-      <w:r>
-        <w:rPr>
-          <w:rFonts w:asciiTheme="majorHAnsi" w:hAnsiTheme="majorHAnsi"/>
-          <w:sz w:val="22"/>
-          <w:lang w:val="vi-VN"/>
-        </w:rPr>
-        <w:t>phình</w:t>
-      </w:r>
-      <w:r>
-        <w:rPr>
-          <w:rFonts w:asciiTheme="majorHAnsi" w:hAnsiTheme="majorHAnsi"/>
-          <w:sz w:val="22"/>
-          <w:lang w:val="vi-VN"/>
-        </w:rPr>
-        <w:t xml:space="preserve"> ra ngoài dự tính</w:t>
+        <w:t xml:space="preserve"> không làm phần tử bị phình ra ngoài dự tính</w:t>
       </w:r>
     </w:p>
     <w:p>
@@ -13705,7 +13997,7 @@
           <w:noProof/>
         </w:rPr>
         <w:pict w14:anchorId="185DE3F1">
-          <v:rect id="_x0000_s1034" alt="" style="width:475.5pt;height:.05pt;mso-width-percent:0;mso-height-percent:0;mso-left-percent:-10001;mso-top-percent:-10001;mso-position-horizontal:absolute;mso-position-horizontal-relative:char;mso-position-vertical:absolute;mso-position-vertical-relative:line;mso-width-percent:0;mso-height-percent:0;mso-left-percent:-10001;mso-top-percent:-10001" o:hralign="center" o:hrstd="t" strokeweight="1pt">
+          <v:rect id="_x0000_s1033" alt="" style="width:475.5pt;height:.05pt;mso-width-percent:0;mso-height-percent:0;mso-left-percent:-10001;mso-top-percent:-10001;mso-position-horizontal:absolute;mso-position-horizontal-relative:char;mso-position-vertical:absolute;mso-position-vertical-relative:line;mso-width-percent:0;mso-height-percent:0;mso-left-percent:-10001;mso-top-percent:-10001" o:hralign="center" o:hrstd="t" strokeweight="1pt">
             <v:stroke opacity="0"/>
           </v:rect>
         </w:pict>
@@ -14226,8 +14518,20 @@
           <w:sz w:val="18"/>
           <w:shd w:val="clear" w:color="auto" w:fill="F8F8FA"/>
         </w:rPr>
-        <w:t>display: inline-block</w:t>
-      </w:r>
+        <w:t xml:space="preserve">display: </w:t>
+      </w:r>
+      <w:proofErr w:type="gramStart"/>
+      <w:r>
+        <w:rPr>
+          <w:rStyle w:val="VerbatimChar"/>
+          <w:rFonts w:ascii="IBM Plex Mono" w:eastAsia="IBM Plex Mono" w:hAnsi="IBM Plex Mono" w:cs="IBM Plex Mono"/>
+          <w:color w:val="000000"/>
+          <w:sz w:val="18"/>
+          <w:shd w:val="clear" w:color="auto" w:fill="F8F8FA"/>
+        </w:rPr>
+        <w:t>inline-block</w:t>
+      </w:r>
+      <w:proofErr w:type="gramEnd"/>
       <w:r>
         <w:rPr>
           <w:rFonts w:ascii="inter" w:eastAsia="inter" w:hAnsi="inter" w:cs="inter"/>
@@ -18118,8 +18422,20 @@
                 <w:color w:val="000000"/>
                 <w:shd w:val="clear" w:color="auto" w:fill="F8F8FA"/>
               </w:rPr>
-              <w:t>display: flex;</w:t>
-            </w:r>
+              <w:t xml:space="preserve">display: </w:t>
+            </w:r>
+            <w:proofErr w:type="gramStart"/>
+            <w:r>
+              <w:rPr>
+                <w:rStyle w:val="VerbatimChar"/>
+                <w:rFonts w:ascii="IBM Plex Mono" w:eastAsia="IBM Plex Mono" w:hAnsi="IBM Plex Mono" w:cs="IBM Plex Mono"/>
+                <w:iCs/>
+                <w:color w:val="000000"/>
+                <w:shd w:val="clear" w:color="auto" w:fill="F8F8FA"/>
+              </w:rPr>
+              <w:t>flex;</w:t>
+            </w:r>
+            <w:proofErr w:type="gramEnd"/>
           </w:p>
           <w:p>
             <w:pPr>
@@ -18184,8 +18500,20 @@
                 <w:color w:val="000000"/>
                 <w:shd w:val="clear" w:color="auto" w:fill="F8F8FA"/>
               </w:rPr>
-              <w:t>display: grid;</w:t>
-            </w:r>
+              <w:t xml:space="preserve">display: </w:t>
+            </w:r>
+            <w:proofErr w:type="gramStart"/>
+            <w:r>
+              <w:rPr>
+                <w:rStyle w:val="VerbatimChar"/>
+                <w:rFonts w:ascii="IBM Plex Mono" w:eastAsia="IBM Plex Mono" w:hAnsi="IBM Plex Mono" w:cs="IBM Plex Mono"/>
+                <w:iCs/>
+                <w:color w:val="000000"/>
+                <w:shd w:val="clear" w:color="auto" w:fill="F8F8FA"/>
+              </w:rPr>
+              <w:t>grid;</w:t>
+            </w:r>
+            <w:proofErr w:type="gramEnd"/>
           </w:p>
           <w:p>
             <w:pPr>
@@ -19751,7 +20079,7 @@
           <w:noProof/>
         </w:rPr>
         <w:pict w14:anchorId="48BE9549">
-          <v:rect id="_x0000_s1033" alt="" style="width:475.5pt;height:.05pt;mso-width-percent:0;mso-height-percent:0;mso-left-percent:-10001;mso-top-percent:-10001;mso-position-horizontal:absolute;mso-position-horizontal-relative:char;mso-position-vertical:absolute;mso-position-vertical-relative:line;mso-width-percent:0;mso-height-percent:0;mso-left-percent:-10001;mso-top-percent:-10001" o:hralign="center" o:hrstd="t" strokeweight="1pt">
+          <v:rect id="_x0000_s1032" alt="" style="width:475.5pt;height:.05pt;mso-width-percent:0;mso-height-percent:0;mso-left-percent:-10001;mso-top-percent:-10001;mso-position-horizontal:absolute;mso-position-horizontal-relative:char;mso-position-vertical:absolute;mso-position-vertical-relative:line;mso-width-percent:0;mso-height-percent:0;mso-left-percent:-10001;mso-top-percent:-10001" o:hralign="center" o:hrstd="t" strokeweight="1pt">
             <v:stroke opacity="0"/>
           </v:rect>
         </w:pict>
@@ -20044,6 +20372,7 @@
         </w:rPr>
         <w:t xml:space="preserve"> </w:t>
       </w:r>
+      <w:proofErr w:type="gramStart"/>
       <w:r>
         <w:rPr>
           <w:rStyle w:val="VerbatimChar"/>
@@ -20054,6 +20383,7 @@
         </w:rPr>
         <w:t>inline-block</w:t>
       </w:r>
+      <w:proofErr w:type="gramEnd"/>
       <w:r>
         <w:rPr>
           <w:rFonts w:ascii="inter" w:eastAsia="inter" w:hAnsi="inter" w:cs="inter"/>
@@ -21938,17 +22268,17 @@
           <w:sz w:val="24"/>
         </w:rPr>
         <w:lastRenderedPageBreak/>
-        <w:t>3. Bà</w:t>
-      </w:r>
-      <w:proofErr w:type="spellStart"/>
-      <w:r>
-        <w:rPr>
-          <w:rFonts w:ascii="inter" w:eastAsia="inter" w:hAnsi="inter" w:cs="inter"/>
-          <w:b/>
-          <w:color w:val="000000"/>
-          <w:sz w:val="24"/>
-        </w:rPr>
-        <w:t>i</w:t>
+        <w:t xml:space="preserve">3. </w:t>
+      </w:r>
+      <w:proofErr w:type="spellStart"/>
+      <w:r>
+        <w:rPr>
+          <w:rFonts w:ascii="inter" w:eastAsia="inter" w:hAnsi="inter" w:cs="inter"/>
+          <w:b/>
+          <w:color w:val="000000"/>
+          <w:sz w:val="24"/>
+        </w:rPr>
+        <w:t>Bài</w:t>
       </w:r>
       <w:proofErr w:type="spellEnd"/>
       <w:r>
@@ -22439,9 +22769,23 @@
           <w:shd w:val="clear" w:color="auto" w:fill="F8F8FA"/>
           <w:lang w:val="fr-FR"/>
         </w:rPr>
-        <w:t>&lt;main&gt;:</w:t>
+        <w:t>&lt;main</w:t>
+      </w:r>
+      <w:proofErr w:type="gramStart"/>
+      <w:r>
+        <w:rPr>
+          <w:rStyle w:val="VerbatimChar"/>
+          <w:rFonts w:ascii="inter" w:eastAsia="inter" w:hAnsi="inter" w:cs="inter"/>
+          <w:b/>
+          <w:color w:val="000000"/>
+          <w:sz w:val="24"/>
+          <w:shd w:val="clear" w:color="auto" w:fill="F8F8FA"/>
+          <w:lang w:val="fr-FR"/>
+        </w:rPr>
+        <w:t>&gt;:</w:t>
       </w:r>
       <w:bookmarkEnd w:id="31"/>
+      <w:proofErr w:type="gramEnd"/>
     </w:p>
     <w:p>
       <w:pPr>
@@ -23209,6 +23553,7 @@
       <w:pPr>
         <w:spacing w:after="210" w:line="360" w:lineRule="auto"/>
       </w:pPr>
+      <w:proofErr w:type="gramStart"/>
       <w:r>
         <w:rPr>
           <w:rStyle w:val="VerbatimChar"/>
@@ -23217,7 +23562,40 @@
           <w:color w:val="000000"/>
           <w:shd w:val="clear" w:color="auto" w:fill="F8F8FA"/>
         </w:rPr>
-        <w:t>repeat(auto-fit, minmax(200px, 1fr))</w:t>
+        <w:t>repeat(</w:t>
+      </w:r>
+      <w:proofErr w:type="gramEnd"/>
+      <w:r>
+        <w:rPr>
+          <w:rStyle w:val="VerbatimChar"/>
+          <w:rFonts w:ascii="inter" w:eastAsia="inter" w:hAnsi="inter" w:cs="inter"/>
+          <w:b/>
+          <w:color w:val="000000"/>
+          <w:shd w:val="clear" w:color="auto" w:fill="F8F8FA"/>
+        </w:rPr>
+        <w:t xml:space="preserve">auto-fit, </w:t>
+      </w:r>
+      <w:proofErr w:type="gramStart"/>
+      <w:r>
+        <w:rPr>
+          <w:rStyle w:val="VerbatimChar"/>
+          <w:rFonts w:ascii="inter" w:eastAsia="inter" w:hAnsi="inter" w:cs="inter"/>
+          <w:b/>
+          <w:color w:val="000000"/>
+          <w:shd w:val="clear" w:color="auto" w:fill="F8F8FA"/>
+        </w:rPr>
+        <w:t>minmax(</w:t>
+      </w:r>
+      <w:proofErr w:type="gramEnd"/>
+      <w:r>
+        <w:rPr>
+          <w:rStyle w:val="VerbatimChar"/>
+          <w:rFonts w:ascii="inter" w:eastAsia="inter" w:hAnsi="inter" w:cs="inter"/>
+          <w:b/>
+          <w:color w:val="000000"/>
+          <w:shd w:val="clear" w:color="auto" w:fill="F8F8FA"/>
+        </w:rPr>
+        <w:t>200px, 1fr))</w:t>
       </w:r>
       <w:r>
         <w:rPr>
@@ -23283,6 +23661,7 @@
         </w:numPr>
         <w:spacing w:before="105" w:after="105" w:line="360" w:lineRule="auto"/>
       </w:pPr>
+      <w:proofErr w:type="gramStart"/>
       <w:r>
         <w:rPr>
           <w:rStyle w:val="VerbatimChar"/>
@@ -23291,7 +23670,18 @@
           <w:sz w:val="18"/>
           <w:shd w:val="clear" w:color="auto" w:fill="F8F8FA"/>
         </w:rPr>
-        <w:t>repeat()</w:t>
+        <w:t>repeat(</w:t>
+      </w:r>
+      <w:proofErr w:type="gramEnd"/>
+      <w:r>
+        <w:rPr>
+          <w:rStyle w:val="VerbatimChar"/>
+          <w:rFonts w:ascii="IBM Plex Mono" w:eastAsia="IBM Plex Mono" w:hAnsi="IBM Plex Mono" w:cs="IBM Plex Mono"/>
+          <w:color w:val="000000"/>
+          <w:sz w:val="18"/>
+          <w:shd w:val="clear" w:color="auto" w:fill="F8F8FA"/>
+        </w:rPr>
+        <w:t>)</w:t>
       </w:r>
       <w:r>
         <w:rPr>
@@ -23662,6 +24052,7 @@
         </w:numPr>
         <w:spacing w:before="105" w:after="105" w:line="360" w:lineRule="auto"/>
       </w:pPr>
+      <w:proofErr w:type="gramStart"/>
       <w:r>
         <w:rPr>
           <w:rStyle w:val="VerbatimChar"/>
@@ -23672,6 +24063,7 @@
         </w:rPr>
         <w:t>auto-fit</w:t>
       </w:r>
+      <w:proofErr w:type="gramEnd"/>
       <w:r>
         <w:rPr>
           <w:rFonts w:ascii="inter" w:eastAsia="inter" w:hAnsi="inter" w:cs="inter"/>
@@ -24029,14 +24421,7 @@
           <w:rFonts w:ascii="inter" w:eastAsia="inter" w:hAnsi="inter" w:cs="inter"/>
           <w:color w:val="000000"/>
         </w:rPr>
-        <w:t xml:space="preserve"> </w:t>
-      </w:r>
-      <w:r>
-        <w:rPr>
-          <w:rFonts w:ascii="inter" w:eastAsia="inter" w:hAnsi="inter" w:cs="inter"/>
-          <w:color w:val="000000"/>
-        </w:rPr>
-        <w:t>hang</w:t>
+        <w:t xml:space="preserve"> hang</w:t>
       </w:r>
     </w:p>
     <w:p>
@@ -24047,6 +24432,7 @@
         </w:numPr>
         <w:spacing w:before="105" w:after="105" w:line="360" w:lineRule="auto"/>
       </w:pPr>
+      <w:proofErr w:type="gramStart"/>
       <w:r>
         <w:rPr>
           <w:rStyle w:val="VerbatimChar"/>
@@ -24055,7 +24441,18 @@
           <w:sz w:val="18"/>
           <w:shd w:val="clear" w:color="auto" w:fill="F8F8FA"/>
         </w:rPr>
-        <w:t>minmax(200px, 1fr)</w:t>
+        <w:t>minmax(</w:t>
+      </w:r>
+      <w:proofErr w:type="gramEnd"/>
+      <w:r>
+        <w:rPr>
+          <w:rStyle w:val="VerbatimChar"/>
+          <w:rFonts w:ascii="IBM Plex Mono" w:eastAsia="IBM Plex Mono" w:hAnsi="IBM Plex Mono" w:cs="IBM Plex Mono"/>
+          <w:color w:val="000000"/>
+          <w:sz w:val="18"/>
+          <w:shd w:val="clear" w:color="auto" w:fill="F8F8FA"/>
+        </w:rPr>
+        <w:t>200px, 1fr)</w:t>
       </w:r>
       <w:r>
         <w:rPr>
@@ -27720,7 +28117,26 @@
           <w:sz w:val="18"/>
         </w:rPr>
         <w:br/>
-        <w:t xml:space="preserve">&lt;!-- </w:t>
+      </w:r>
+      <w:proofErr w:type="gramStart"/>
+      <w:r>
+        <w:rPr>
+          <w:rStyle w:val="VerbatimChar"/>
+          <w:rFonts w:ascii="IBM Plex Mono" w:eastAsia="IBM Plex Mono" w:hAnsi="IBM Plex Mono" w:cs="IBM Plex Mono"/>
+          <w:color w:val="000000"/>
+          <w:sz w:val="18"/>
+        </w:rPr>
+        <w:t>&lt;!--</w:t>
+      </w:r>
+      <w:proofErr w:type="gramEnd"/>
+      <w:r>
+        <w:rPr>
+          <w:rStyle w:val="VerbatimChar"/>
+          <w:rFonts w:ascii="IBM Plex Mono" w:eastAsia="IBM Plex Mono" w:hAnsi="IBM Plex Mono" w:cs="IBM Plex Mono"/>
+          <w:color w:val="000000"/>
+          <w:sz w:val="18"/>
+        </w:rPr>
+        <w:t xml:space="preserve"> </w:t>
       </w:r>
       <w:proofErr w:type="spellStart"/>
       <w:r>
@@ -29357,7 +29773,16 @@
           <w:b/>
           <w:color w:val="000000"/>
         </w:rPr>
-        <w:t xml:space="preserve">2. Pseudo-class </w:t>
+        <w:t>2. Pseudo-</w:t>
+      </w:r>
+      <w:proofErr w:type="gramStart"/>
+      <w:r>
+        <w:rPr>
+          <w:rFonts w:ascii="inter" w:eastAsia="inter" w:hAnsi="inter" w:cs="inter"/>
+          <w:b/>
+          <w:color w:val="000000"/>
+        </w:rPr>
+        <w:t xml:space="preserve">class </w:t>
       </w:r>
       <w:r>
         <w:rPr>
@@ -29367,7 +29792,18 @@
           <w:color w:val="000000"/>
           <w:shd w:val="clear" w:color="auto" w:fill="F8F8FA"/>
         </w:rPr>
-        <w:t xml:space="preserve">:hover </w:t>
+        <w:t>:hover</w:t>
+      </w:r>
+      <w:proofErr w:type="gramEnd"/>
+      <w:r>
+        <w:rPr>
+          <w:rStyle w:val="VerbatimChar"/>
+          <w:rFonts w:ascii="inter" w:eastAsia="inter" w:hAnsi="inter" w:cs="inter"/>
+          <w:b/>
+          <w:color w:val="000000"/>
+          <w:shd w:val="clear" w:color="auto" w:fill="F8F8FA"/>
+        </w:rPr>
+        <w:t xml:space="preserve"> </w:t>
       </w:r>
       <w:proofErr w:type="spellStart"/>
       <w:r>
@@ -35758,6 +36194,7 @@
   <w:style w:type="character" w:default="1" w:styleId="Phngmcinhcuaoanvn">
     <w:name w:val="Default Paragraph Font"/>
     <w:uiPriority w:val="1"/>
+    <w:semiHidden/>
     <w:unhideWhenUsed/>
   </w:style>
   <w:style w:type="table" w:default="1" w:styleId="BangThngthng">

</xml_diff>